<commit_message>
Lito 40 dias: novo gancho
Co-Authored-By: Claude Opus 5.5 <noreply@anthropic.com>
Claude-Session: https://claude.ai/code/session_01MJjUEEZrxQDEUifKK2vj9g
</commit_message>
<xml_diff>
--- a/roteiros/lito-sousa-morte/LitoSousa40_Parte1.docx
+++ b/roteiros/lito-sousa-morte/LitoSousa40_Parte1.docx
@@ -15,7 +15,7 @@
         <w:rPr>
           <w:color w:val="C00000"/>
         </w:rPr>
-        <w:t>Lito Sousa passou a vida inteira ensinando o Brasil a não ter medo de voar. No dia primeiro de outubro de dois mil e vinte e seis, quarenta e um dias depois de receber o diagnóstico, ele fez o último voo.</w:t>
+        <w:t>Lito Sousa passou mais de trinta anos consertando aviões e ensinando o Brasil a entender por que eles caem. Mas, em pouco mais de quarenta dias, foi ele quem perdeu uma luta que nenhum mecânico do mundo conseguiria vencer.</w:t>
       </w:r>
     </w:p>
     <w:p>
@@ -23,7 +23,7 @@
         <w:rPr>
           <w:color w:val="C00000"/>
         </w:rPr>
-        <w:t>Nesses quarenta e um dias, a família tentou uma coisa que nenhum ser humano no mundo tinha tentado antes. E teve gente que transformou o desespero dela em ataque.</w:t>
+        <w:t>O que pouca gente sabe é que, no meio dessa corrida contra o tempo, Lito se tornou o primeiro ser humano do mundo a receber um remédio que ninguém sabia o que ia fazer.</w:t>
       </w:r>
     </w:p>
     <w:p>
@@ -31,7 +31,7 @@
         <w:rPr>
           <w:color w:val="C00000"/>
         </w:rPr>
-        <w:t>Fique até o final… porque a despedida que a esposa gravou para ele tem uma frase que ninguém consegue ouvir sem chorar.</w:t>
+        <w:t>Fique até o final, porque você vai descobrir o que aconteceu depois daquela dose. E a frase que a esposa dele gravou na despedida, que fez o Brasil inteiro chorar.</w:t>
       </w:r>
     </w:p>
     <w:p>
@@ -39,7 +39,7 @@
         <w:rPr>
           <w:color w:val="000000"/>
         </w:rPr>
-        <w:t>Mas, antes de chegar a esses quarenta e um dias, é preciso entender quem era o homem que milhões de brasileiros chamavam só de Lito. E por que a doença que levou ele parece ter sido escrita para atingir justamente aquilo que ele tinha de mais forte.</w:t>
+        <w:t>Mas, antes de chegar a esses quarenta dias, é preciso entender quem era o homem que milhões de brasileiros chamavam só de Lito. E por que a doença que levou ele parece ter sido escrita para atingir justamente aquilo que ele tinha de mais forte.</w:t>
       </w:r>
     </w:p>
     <w:p>

</xml_diff>

<commit_message>
Lito 40 dias: revisão Parte 1
Co-Authored-By: Claude Opus 5.5 <noreply@anthropic.com>
Claude-Session: https://claude.ai/code/session_01MJjUEEZrxQDEUifKK2vj9g
</commit_message>
<xml_diff>
--- a/roteiros/lito-sousa-morte/LitoSousa40_Parte1.docx
+++ b/roteiros/lito-sousa-morte/LitoSousa40_Parte1.docx
@@ -39,7 +39,7 @@
         <w:rPr>
           <w:color w:val="000000"/>
         </w:rPr>
-        <w:t>Mas, antes de chegar a esses quarenta dias, é preciso entender quem era o homem que milhões de brasileiros chamavam só de Lito. E por que a doença que levou ele parece ter sido escrita para atingir justamente aquilo que ele tinha de mais forte.</w:t>
+        <w:t>Mas, antes de chegar a esses quarenta dias, é preciso entender quem era o homem que milhões de brasileiros chamavam só de Lito. E por que a doença que levou ele atacou justamente aquilo que fez o Brasil inteiro confiar nele.</w:t>
       </w:r>
     </w:p>
     <w:p>
@@ -191,7 +191,7 @@
         <w:rPr>
           <w:color w:val="C00000"/>
         </w:rPr>
-        <w:t>Imagine ter um filho de seis anos, uma carreira no auge e milhões de pessoas que confiam na sua voz. E descobrir que o tempo que você achava que tinha simplesmente não existe. Foi isso que aconteceu com Lito em menos de três meses.</w:t>
+        <w:t>Imagine ter um filho pequeno, uma carreira no auge e milhões de pessoas que confiam na sua voz. E descobrir que o tempo que você achava que tinha simplesmente não existe. Foi isso que aconteceu com Lito em menos de três meses.</w:t>
       </w:r>
     </w:p>
     <w:p>
@@ -215,7 +215,7 @@
         <w:rPr>
           <w:color w:val="000000"/>
         </w:rPr>
-        <w:t>Em abril de dois mil e vinte e seis, numa bateria de exames de rotina, os médicos encontraram um câncer na próstata.</w:t>
+        <w:t>Por volta de abril de dois mil e vinte e seis, numa bateria de exames de rotina, os médicos encontraram um câncer na próstata.</w:t>
       </w:r>
     </w:p>
     <w:p>
@@ -247,7 +247,7 @@
         <w:rPr>
           <w:color w:val="000000"/>
         </w:rPr>
-        <w:t>Esse é o primeiro objeto dessa história. Um vídeo gravado em casa, com Lito ainda falando com a voz de sempre.</w:t>
+        <w:t>Esse é o primeiro objeto dessa história. Um vídeo em que Lito ainda falava com a voz calma de sempre.</w:t>
       </w:r>
     </w:p>
     <w:p>
@@ -279,7 +279,7 @@
         <w:rPr>
           <w:color w:val="000000"/>
         </w:rPr>
-        <w:t>Ninguém prestou muita atenção nesse detalhe. O assunto do vídeo era o câncer.</w:t>
+        <w:t>No vídeo, aquilo parecia só mais um detalhe. O assunto principal era o câncer.</w:t>
       </w:r>
     </w:p>
     <w:p>
@@ -311,7 +311,7 @@
         <w:rPr>
           <w:color w:val="C00000"/>
         </w:rPr>
-        <w:t>Lembre desse vídeo. E lembre do braço dormente. Porque, quando os médicos finalmente descobriram de onde vinha aquela dormência, o câncer virou o menor dos problemas.</w:t>
+        <w:t>Aquele braço dormente, citado quase de passagem, era o sinal mais importante do vídeo inteiro. Quando os médicos descobriram de onde ele vinha, o câncer virou o menor dos problemas.</w:t>
       </w:r>
     </w:p>
     <w:p>
@@ -343,7 +343,7 @@
         <w:rPr>
           <w:color w:val="000000"/>
         </w:rPr>
-        <w:t>Do leito, Lito gravou vídeos curtos. Mostrava pequenos movimentos da mão. Pedia que os fãs continuassem mandando energia.</w:t>
+        <w:t>Do leito, Lito gravou vídeos curtos. Mostrava pequenos movimentos da mão. "Sigam nas mentalizações", pedia aos fãs.</w:t>
       </w:r>
     </w:p>
     <w:p>

</xml_diff>

<commit_message>
Lito 40 dias: revisão geral, pacote e thumbnails
Co-Authored-By: Claude Opus 5.5 <noreply@anthropic.com>
Claude-Session: https://claude.ai/code/session_01MJjUEEZrxQDEUifKK2vj9g
</commit_message>
<xml_diff>
--- a/roteiros/lito-sousa-morte/LitoSousa40_Parte1.docx
+++ b/roteiros/lito-sousa-morte/LitoSousa40_Parte1.docx
@@ -71,7 +71,7 @@
         <w:rPr>
           <w:color w:val="000000"/>
         </w:rPr>
-        <w:t>Aos dezenove anos, entrou num curso técnico da Força Aérea Brasileira. Aprendeu a abrir motores e a procurar o defeito escondido que ninguém mais via.</w:t>
+        <w:t>Aos dezenove anos, entrou num curso técnico da Força Aérea Brasileira. Aprendeu a abrir motores e a procurar o defeito escondido dentro de cada peça.</w:t>
       </w:r>
     </w:p>
     <w:p>
@@ -335,7 +335,7 @@
         <w:rPr>
           <w:color w:val="000000"/>
         </w:rPr>
-        <w:t>Os médicos fizeram exames neurológicos e encontraram uma inflamação no sistema nervoso central. Ninguém sabia a causa.</w:t>
+        <w:t>Os médicos fizeram exames neurológicos e encontraram uma inflamação no sistema nervoso central. A causa continuava um mistério.</w:t>
       </w:r>
     </w:p>
     <w:p>

</xml_diff>